<commit_message>
Dubbele leestekens in het werkdocument; intro stap 5 en Vast? aangepast
Co-Authored-By: Claude Sonnet 5.5 <noreply@anthropic.com>
</commit_message>
<xml_diff>
--- a/werkdocument/Ouderbericht.docx
+++ b/werkdocument/Ouderbericht.docx
@@ -817,7 +817,7 @@
                 <w:i/>
                 <w:color w:val="5F6368"/>
               </w:rPr>
-              <w:t xml:space="preserve">Begin met </w:t>
+              <w:t xml:space="preserve">Begin met een aanspreking: </w:t>
             </w:r>
             <w:r>
               <w:rPr>
@@ -826,14 +826,6 @@
                 <w:color w:val="5F6368"/>
               </w:rPr>
               <w:t>Beste ouders,</w:t>
-            </w:r>
-            <w:r>
-              <w:rPr>
-                <w:b w:val="0"/>
-                <w:i/>
-                <w:color w:val="5F6368"/>
-              </w:rPr>
-              <w:t>.</w:t>
             </w:r>
           </w:p>
         </w:tc>
@@ -2023,21 +2015,7 @@
                 <w:b w:val="0"/>
                 <w:i w:val="0"/>
               </w:rPr>
-              <w:t xml:space="preserve">Deel 3: mijn bericht is kort, positief en beleefd: </w:t>
-            </w:r>
-            <w:r>
-              <w:rPr>
-                <w:b w:val="0"/>
-                <w:i/>
-              </w:rPr>
-              <w:t>Beste ouders,</w:t>
-            </w:r>
-            <w:r>
-              <w:rPr>
-                <w:b w:val="0"/>
-                <w:i w:val="0"/>
-              </w:rPr>
-              <w:t xml:space="preserve">, overal </w:t>
+              <w:t xml:space="preserve">Deel 3: mijn bericht is kort, positief en beleefd: een aanspreking, overal </w:t>
             </w:r>
             <w:r>
               <w:rPr>

</xml_diff>

<commit_message>
Speelboom-app: geen los 'app' meer, maar 'een berichtje in de Speelboom-app'
Co-Authored-By: Claude Opus 5.5 <noreply@anthropic.com>
</commit_message>
<xml_diff>
--- a/werkdocument/Ouderbericht.docx
+++ b/werkdocument/Ouderbericht.docx
@@ -259,6 +259,20 @@
               <w:rPr>
                 <w:b/>
               </w:rPr>
+              <w:t xml:space="preserve">Berichtjes:  </w:t>
+            </w:r>
+            <w:r>
+              <w:t>De Speelboom stuurt de ouders berichtjes via een eigen app: de Speelboom-app.</w:t>
+            </w:r>
+          </w:p>
+          <w:p>
+            <w:pPr>
+              <w:spacing w:after="60"/>
+            </w:pPr>
+            <w:r>
+              <w:rPr>
+                <w:b/>
+              </w:rPr>
               <w:t xml:space="preserve">Jouw rol:  </w:t>
             </w:r>
             <w:r>
@@ -359,7 +373,7 @@
                 <w:color w:val="2A3973"/>
                 <w:sz w:val="22"/>
               </w:rPr>
-              <w:t>App, bellen of gesprek?</w:t>
+              <w:t>Speelboom-app, bellen of gesprek?</w:t>
             </w:r>
           </w:p>
         </w:tc>
@@ -426,7 +440,7 @@
                 <w:i/>
                 <w:color w:val="5F6368"/>
               </w:rPr>
-              <w:t>app</w:t>
+              <w:t>Speelboom-app</w:t>
             </w:r>
           </w:p>
         </w:tc>
@@ -569,7 +583,7 @@
                 <w:b w:val="0"/>
                 <w:i w:val="0"/>
               </w:rPr>
-              <w:t>d.  Een papa vraagt in de app of de muts van zijn dochter nog in De Speelboom ligt.</w:t>
+              <w:t>d.  Een papa vraagt met een berichtje in de Speelboom-app of de muts van zijn dochter nog in De Speelboom ligt.</w:t>
             </w:r>
           </w:p>
         </w:tc>
@@ -1730,7 +1744,7 @@
                 <w:b w:val="0"/>
                 <w:i/>
               </w:rPr>
-              <w:t>app</w:t>
+              <w:t>Speelboom-app</w:t>
             </w:r>
             <w:r>
               <w:rPr>
@@ -2205,7 +2219,7 @@
         <w:rPr>
           <w:b/>
         </w:rPr>
-        <w:t>Waarom vertel je moeilijk nieuws liever niet in de app?</w:t>
+        <w:t>Waarom vertel je moeilijk nieuws liever niet met een berichtje in de Speelboom-app?</w:t>
       </w:r>
     </w:p>
     <w:tbl>
@@ -2282,7 +2296,7 @@
         <w:rPr>
           <w:b/>
         </w:rPr>
-        <w:t>Een mama antwoordt in de app: “Mijn zoon heeft geen laarzen. Mag hij met sportschoenen komen?” Schrijf een kort, vriendelijk antwoord.</w:t>
+        <w:t>Een mama antwoordt met een berichtje in de Speelboom-app: “Mijn zoon heeft geen laarzen. Mag hij met sportschoenen komen?” Schrijf een kort, vriendelijk antwoord.</w:t>
       </w:r>
     </w:p>
     <w:tbl>

</xml_diff>

<commit_message>
Stap 5: de leerlingen zoeken de vertaalfouten zelf, vertalingen en pictogrammen in een infokader
Co-Authored-By: Claude Opus 5.5 <noreply@anthropic.com>
</commit_message>
<xml_diff>
--- a/werkdocument/Ouderbericht.docx
+++ b/werkdocument/Ouderbericht.docx
@@ -1420,7 +1420,7 @@
         <w:rPr>
           <w:b/>
         </w:rPr>
-        <w:t>a.  Wat ging er mis in de vertaling? Noem twee dingen.</w:t>
+        <w:t>a.  Welke twee fouten maakte Google Vertalen in de zin van Kobe?</w:t>
       </w:r>
     </w:p>
     <w:tbl>
@@ -1434,22 +1434,164 @@
           <w:left w:val="single" w:sz="6" w:space="0" w:color="A7B1DE"/>
           <w:bottom w:val="single" w:sz="6" w:space="0" w:color="A7B1DE"/>
           <w:right w:val="single" w:sz="6" w:space="0" w:color="A7B1DE"/>
-          <w:insideH w:val="nil"/>
-          <w:insideV w:val="nil"/>
+          <w:insideH w:val="single" w:sz="6" w:space="0" w:color="D5DAEE"/>
+          <w:insideV w:val="single" w:sz="6" w:space="0" w:color="D5DAEE"/>
         </w:tblBorders>
         <w:tblLayout w:type="fixed"/>
       </w:tblPr>
       <w:tblGrid>
-        <w:gridCol w:w="9638"/>
+        <w:gridCol w:w="454"/>
+        <w:gridCol w:w="3515"/>
+        <w:gridCol w:w="5669"/>
       </w:tblGrid>
       <w:tr>
         <w:trPr>
-          <w:trHeight w:val="1020" w:hRule="atLeast"/>
           <w:cantSplit/>
         </w:trPr>
         <w:tc>
           <w:tcPr>
-            <w:tcW w:type="dxa" w:w="9638"/>
+            <w:tcW w:type="dxa" w:w="454"/>
+            <w:shd w:val="clear" w:color="auto" w:fill="E4E8F6"/>
+          </w:tcPr>
+          <w:p>
+            <w:pPr>
+              <w:spacing w:before="0" w:after="0"/>
+            </w:pPr>
+            <w:r/>
+          </w:p>
+        </w:tc>
+        <w:tc>
+          <w:tcPr>
+            <w:tcW w:type="dxa" w:w="3515"/>
+            <w:shd w:val="clear" w:color="auto" w:fill="E4E8F6"/>
+          </w:tcPr>
+          <w:p>
+            <w:pPr>
+              <w:spacing w:before="0" w:after="0"/>
+            </w:pPr>
+            <w:r/>
+            <w:r>
+              <w:rPr>
+                <w:b/>
+                <w:i w:val="0"/>
+                <w:color w:val="2A3973"/>
+                <w:sz w:val="22"/>
+              </w:rPr>
+              <w:t>Kobe schreef</w:t>
+            </w:r>
+          </w:p>
+        </w:tc>
+        <w:tc>
+          <w:tcPr>
+            <w:tcW w:type="dxa" w:w="5669"/>
+            <w:shd w:val="clear" w:color="auto" w:fill="E4E8F6"/>
+          </w:tcPr>
+          <w:p>
+            <w:pPr>
+              <w:spacing w:before="0" w:after="0"/>
+            </w:pPr>
+            <w:r/>
+            <w:r>
+              <w:rPr>
+                <w:b/>
+                <w:i w:val="0"/>
+                <w:color w:val="2A3973"/>
+                <w:sz w:val="22"/>
+              </w:rPr>
+              <w:t>Google Vertalen maakte ervan</w:t>
+            </w:r>
+          </w:p>
+        </w:tc>
+      </w:tr>
+      <w:tr>
+        <w:trPr>
+          <w:trHeight w:val="567" w:hRule="atLeast"/>
+          <w:cantSplit/>
+        </w:trPr>
+        <w:tc>
+          <w:tcPr>
+            <w:tcW w:type="dxa" w:w="454"/>
+            <w:vAlign w:val="center"/>
+          </w:tcPr>
+          <w:p>
+            <w:pPr>
+              <w:spacing w:before="0" w:after="0"/>
+            </w:pPr>
+            <w:r/>
+            <w:r>
+              <w:rPr>
+                <w:b w:val="0"/>
+                <w:i w:val="0"/>
+              </w:rPr>
+              <w:t>1</w:t>
+            </w:r>
+          </w:p>
+        </w:tc>
+        <w:tc>
+          <w:tcPr>
+            <w:tcW w:type="dxa" w:w="3515"/>
+            <w:vAlign w:val="center"/>
+            <w:shd w:val="clear" w:color="auto" w:fill="F3F5FC"/>
+          </w:tcPr>
+          <w:p>
+            <w:pPr>
+              <w:spacing w:before="0" w:after="0"/>
+            </w:pPr>
+          </w:p>
+        </w:tc>
+        <w:tc>
+          <w:tcPr>
+            <w:tcW w:type="dxa" w:w="5669"/>
+            <w:vAlign w:val="center"/>
+            <w:shd w:val="clear" w:color="auto" w:fill="F3F5FC"/>
+          </w:tcPr>
+          <w:p>
+            <w:pPr>
+              <w:spacing w:before="0" w:after="0"/>
+            </w:pPr>
+          </w:p>
+        </w:tc>
+      </w:tr>
+      <w:tr>
+        <w:trPr>
+          <w:trHeight w:val="567" w:hRule="atLeast"/>
+          <w:cantSplit/>
+        </w:trPr>
+        <w:tc>
+          <w:tcPr>
+            <w:tcW w:type="dxa" w:w="454"/>
+            <w:vAlign w:val="center"/>
+          </w:tcPr>
+          <w:p>
+            <w:pPr>
+              <w:spacing w:before="0" w:after="0"/>
+            </w:pPr>
+            <w:r/>
+            <w:r>
+              <w:rPr>
+                <w:b w:val="0"/>
+                <w:i w:val="0"/>
+              </w:rPr>
+              <w:t>2</w:t>
+            </w:r>
+          </w:p>
+        </w:tc>
+        <w:tc>
+          <w:tcPr>
+            <w:tcW w:type="dxa" w:w="3515"/>
+            <w:vAlign w:val="center"/>
+            <w:shd w:val="clear" w:color="auto" w:fill="F3F5FC"/>
+          </w:tcPr>
+          <w:p>
+            <w:pPr>
+              <w:spacing w:before="0" w:after="0"/>
+            </w:pPr>
+          </w:p>
+        </w:tc>
+        <w:tc>
+          <w:tcPr>
+            <w:tcW w:type="dxa" w:w="5669"/>
+            <w:vAlign w:val="center"/>
             <w:shd w:val="clear" w:color="auto" w:fill="F3F5FC"/>
           </w:tcPr>
           <w:p>
@@ -1477,7 +1619,7 @@
         <w:rPr>
           <w:b/>
         </w:rPr>
-        <w:t>b.  Schrijf deze zin van Kobe opnieuw, in eenvoudige taal.</w:t>
+        <w:t>b.  Schrijf de zin van Kobe opnieuw, zodat Google Vertalen geen fouten meer maakt.</w:t>
       </w:r>
     </w:p>
     <w:p>
@@ -2175,7 +2317,7 @@
                 <w:b w:val="0"/>
                 <w:i w:val="0"/>
               </w:rPr>
-              <w:t>Deel 4: wat er misging, de zin in eenvoudige taal en twee passende pictogrammen.</w:t>
+              <w:t>Deel 4: de twee fouten van Google Vertalen, de zin zonder die fouten en twee passende pictogrammen.</w:t>
             </w:r>
           </w:p>
         </w:tc>

</xml_diff>

<commit_message>
Slotvraag telt voor 1 punt (deel 1 nu 3); § 22 met de verdeling per onderdeel
Jonas, 19-10-2026: 'Geef slotvraag maar punten.' Controletabel en Google-document aan het
concept bijgewerkt (zelfde bestand, DRAFT); de beelden van deel 5 opnieuw. § 22: hoe de
punten verdeeld worden, de feiten uit het kader, Jonas' beslissingen; § 14: wat niet telt.

Co-Authored-By: Claude Opus 5.5 <noreply@anthropic.com>
</commit_message>
<xml_diff>
--- a/werkdocument/Ouderbericht.docx
+++ b/werkdocument/Ouderbericht.docx
@@ -1999,7 +1999,7 @@
                 <w:color w:val="5F6368"/>
                 <w:sz w:val="24"/>
               </w:rPr>
-              <w:t>/ 4</w:t>
+              <w:t>/ 3</w:t>
             </w:r>
           </w:p>
         </w:tc>
@@ -2400,6 +2400,65 @@
           </w:p>
         </w:tc>
       </w:tr>
+      <w:tr>
+        <w:trPr>
+          <w:trHeight w:val="510" w:hRule="atLeast"/>
+          <w:cantSplit/>
+        </w:trPr>
+        <w:tc>
+          <w:tcPr>
+            <w:tcW w:type="dxa" w:w="907"/>
+            <w:shd w:val="clear" w:color="auto" w:fill="F3F5FC"/>
+            <w:vAlign w:val="center"/>
+          </w:tcPr>
+          <w:p>
+            <w:pPr>
+              <w:spacing w:before="0" w:after="0"/>
+              <w:jc w:val="center"/>
+            </w:pPr>
+          </w:p>
+        </w:tc>
+        <w:tc>
+          <w:tcPr>
+            <w:tcW w:type="dxa" w:w="7597"/>
+            <w:vAlign w:val="center"/>
+          </w:tcPr>
+          <w:p>
+            <w:pPr>
+              <w:spacing w:before="0" w:after="0"/>
+            </w:pPr>
+            <w:r/>
+            <w:r>
+              <w:rPr>
+                <w:b w:val="0"/>
+                <w:i w:val="0"/>
+              </w:rPr>
+              <w:t>Slotvraag: ik schreef waarom moeilijk nieuws beter niet met een berichtje gaat.</w:t>
+            </w:r>
+          </w:p>
+        </w:tc>
+        <w:tc>
+          <w:tcPr>
+            <w:tcW w:type="dxa" w:w="1134"/>
+            <w:vAlign w:val="center"/>
+          </w:tcPr>
+          <w:p>
+            <w:pPr>
+              <w:jc w:val="right"/>
+            </w:pPr>
+            <w:r>
+              <w:rPr>
+                <w:rFonts w:ascii="Calibri" w:hAnsi="Calibri" w:eastAsia="Calibri"/>
+                <w:b w:val="0"/>
+                <w:i w:val="0"/>
+                <w:color w:val="5F6368"/>
+                <w:sz w:val="24"/>
+              </w:rPr>
+              <w:t>/ 1</w:t>
+            </w:r>
+          </w:p>
+        </w:tc>
+      </w:tr>
     </w:tbl>
     <w:p>
       <w:pPr>

</xml_diff>